<commit_message>
Bitácora con anexo VLSM y ajuste de Siembra en Talca a /27
Co-Authored-By: Claude Opus 5.5 <noreply@anthropic.com>
Claude-Session: https://claude.ai/code/session_01Fjm1LhdDuDRXrKBvFUSdBx
</commit_message>
<xml_diff>
--- a/Direccionamiento_VLSM_Agroprodel.docx
+++ b/Direccionamiento_VLSM_Agroprodel.docx
@@ -1594,7 +1594,7 @@
                 <w:sz w:val="17"/>
                 <w:szCs w:val="17"/>
               </w:rPr>
-              <w:t xml:space="preserve">192 de 256 (75 %)</w:t>
+              <w:t xml:space="preserve">208 de 256 (81 %)</w:t>
             </w:r>
           </w:p>
         </w:tc>
@@ -1629,7 +1629,7 @@
                 <w:sz w:val="17"/>
                 <w:szCs w:val="17"/>
               </w:rPr>
-              <w:t xml:space="preserve">192.168.10.192/26</w:t>
+              <w:t xml:space="preserve">192.168.10.208/28, 192.168.10.224/27</w:t>
             </w:r>
           </w:p>
         </w:tc>
@@ -6890,7 +6890,7 @@
                 <w:sz w:val="17"/>
                 <w:szCs w:val="17"/>
               </w:rPr>
-              <w:t xml:space="preserve">20</w:t>
+              <w:t xml:space="preserve">10</w:t>
             </w:r>
           </w:p>
         </w:tc>
@@ -6925,7 +6925,7 @@
                 <w:sz w:val="17"/>
                 <w:szCs w:val="17"/>
               </w:rPr>
-              <w:t xml:space="preserve">COSECHA_MOLIENDA</w:t>
+              <w:t xml:space="preserve">SIEMBRA_RIEGO</w:t>
             </w:r>
           </w:p>
         </w:tc>
@@ -6960,7 +6960,7 @@
                 <w:sz w:val="17"/>
                 <w:szCs w:val="17"/>
               </w:rPr>
-              <w:t xml:space="preserve">18</w:t>
+              <w:t xml:space="preserve">10</w:t>
             </w:r>
           </w:p>
         </w:tc>
@@ -6995,7 +6995,7 @@
                 <w:sz w:val="17"/>
                 <w:szCs w:val="17"/>
               </w:rPr>
-              <w:t xml:space="preserve">5</w:t>
+              <w:t xml:space="preserve">3</w:t>
             </w:r>
           </w:p>
         </w:tc>
@@ -7030,7 +7030,7 @@
                 <w:sz w:val="17"/>
                 <w:szCs w:val="17"/>
               </w:rPr>
-              <w:t xml:space="preserve">24</w:t>
+              <w:t xml:space="preserve">14</w:t>
             </w:r>
           </w:p>
         </w:tc>
@@ -7240,7 +7240,7 @@
                 <w:sz w:val="17"/>
                 <w:szCs w:val="17"/>
               </w:rPr>
-              <w:t xml:space="preserve">11</w:t>
+              <w:t xml:space="preserve">19</w:t>
             </w:r>
           </w:p>
         </w:tc>
@@ -7276,7 +7276,7 @@
                 <w:sz w:val="17"/>
                 <w:szCs w:val="17"/>
               </w:rPr>
-              <w:t xml:space="preserve">10</w:t>
+              <w:t xml:space="preserve">20</w:t>
             </w:r>
           </w:p>
         </w:tc>
@@ -7310,7 +7310,7 @@
                 <w:sz w:val="17"/>
                 <w:szCs w:val="17"/>
               </w:rPr>
-              <w:t xml:space="preserve">SIEMBRA_RIEGO</w:t>
+              <w:t xml:space="preserve">COSECHA_MOLIENDA</w:t>
             </w:r>
           </w:p>
         </w:tc>
@@ -7344,7 +7344,7 @@
                 <w:sz w:val="17"/>
                 <w:szCs w:val="17"/>
               </w:rPr>
-              <w:t xml:space="preserve">10</w:t>
+              <w:t xml:space="preserve">18</w:t>
             </w:r>
           </w:p>
         </w:tc>
@@ -7378,7 +7378,7 @@
                 <w:sz w:val="17"/>
                 <w:szCs w:val="17"/>
               </w:rPr>
-              <w:t xml:space="preserve">3</w:t>
+              <w:t xml:space="preserve">5</w:t>
             </w:r>
           </w:p>
         </w:tc>
@@ -7412,7 +7412,7 @@
                 <w:sz w:val="17"/>
                 <w:szCs w:val="17"/>
               </w:rPr>
-              <w:t xml:space="preserve">14</w:t>
+              <w:t xml:space="preserve">24</w:t>
             </w:r>
           </w:p>
         </w:tc>
@@ -7446,7 +7446,7 @@
                 <w:sz w:val="17"/>
                 <w:szCs w:val="17"/>
               </w:rPr>
-              <w:t xml:space="preserve">/28  255.255.255.240</w:t>
+              <w:t xml:space="preserve">/27  255.255.255.224</w:t>
             </w:r>
           </w:p>
         </w:tc>
@@ -7548,7 +7548,7 @@
                 <w:sz w:val="17"/>
                 <w:szCs w:val="17"/>
               </w:rPr>
-              <w:t xml:space="preserve">192.168.10.98 – 192.168.10.110</w:t>
+              <w:t xml:space="preserve">192.168.10.98 – 192.168.10.126</w:t>
             </w:r>
           </w:p>
         </w:tc>
@@ -7582,7 +7582,7 @@
                 <w:sz w:val="17"/>
                 <w:szCs w:val="17"/>
               </w:rPr>
-              <w:t xml:space="preserve">192.168.10.111</w:t>
+              <w:t xml:space="preserve">192.168.10.127</w:t>
             </w:r>
           </w:p>
         </w:tc>
@@ -7616,7 +7616,7 @@
                 <w:sz w:val="17"/>
                 <w:szCs w:val="17"/>
               </w:rPr>
-              <w:t xml:space="preserve">3</w:t>
+              <w:t xml:space="preserve">11</w:t>
             </w:r>
           </w:p>
         </w:tc>
@@ -7863,7 +7863,7 @@
                 <w:sz w:val="17"/>
                 <w:szCs w:val="17"/>
               </w:rPr>
-              <w:t xml:space="preserve">192.168.10.112</w:t>
+              <w:t xml:space="preserve">192.168.10.128</w:t>
             </w:r>
           </w:p>
         </w:tc>
@@ -7898,7 +7898,7 @@
                 <w:sz w:val="17"/>
                 <w:szCs w:val="17"/>
               </w:rPr>
-              <w:t xml:space="preserve">192.168.10.113</w:t>
+              <w:t xml:space="preserve">192.168.10.129</w:t>
             </w:r>
           </w:p>
         </w:tc>
@@ -7933,7 +7933,7 @@
                 <w:sz w:val="17"/>
                 <w:szCs w:val="17"/>
               </w:rPr>
-              <w:t xml:space="preserve">192.168.10.114 – 192.168.10.126</w:t>
+              <w:t xml:space="preserve">192.168.10.130 – 192.168.10.142</w:t>
             </w:r>
           </w:p>
         </w:tc>
@@ -7968,7 +7968,7 @@
                 <w:sz w:val="17"/>
                 <w:szCs w:val="17"/>
               </w:rPr>
-              <w:t xml:space="preserve">192.168.10.127</w:t>
+              <w:t xml:space="preserve">192.168.10.143</w:t>
             </w:r>
           </w:p>
         </w:tc>
@@ -8243,7 +8243,7 @@
                 <w:sz w:val="17"/>
                 <w:szCs w:val="17"/>
               </w:rPr>
-              <w:t xml:space="preserve">192.168.10.128</w:t>
+              <w:t xml:space="preserve">192.168.10.144</w:t>
             </w:r>
           </w:p>
         </w:tc>
@@ -8277,7 +8277,7 @@
                 <w:sz w:val="17"/>
                 <w:szCs w:val="17"/>
               </w:rPr>
-              <w:t xml:space="preserve">192.168.10.129</w:t>
+              <w:t xml:space="preserve">192.168.10.145</w:t>
             </w:r>
           </w:p>
         </w:tc>
@@ -8311,7 +8311,7 @@
                 <w:sz w:val="17"/>
                 <w:szCs w:val="17"/>
               </w:rPr>
-              <w:t xml:space="preserve">192.168.10.130 – 192.168.10.142</w:t>
+              <w:t xml:space="preserve">192.168.10.146 – 192.168.10.158</w:t>
             </w:r>
           </w:p>
         </w:tc>
@@ -8345,7 +8345,7 @@
                 <w:sz w:val="17"/>
                 <w:szCs w:val="17"/>
               </w:rPr>
-              <w:t xml:space="preserve">192.168.10.143</w:t>
+              <w:t xml:space="preserve">192.168.10.159</w:t>
             </w:r>
           </w:p>
         </w:tc>
@@ -8626,7 +8626,7 @@
                 <w:sz w:val="17"/>
                 <w:szCs w:val="17"/>
               </w:rPr>
-              <w:t xml:space="preserve">192.168.10.144</w:t>
+              <w:t xml:space="preserve">192.168.10.160</w:t>
             </w:r>
           </w:p>
         </w:tc>
@@ -8661,7 +8661,7 @@
                 <w:sz w:val="17"/>
                 <w:szCs w:val="17"/>
               </w:rPr>
-              <w:t xml:space="preserve">192.168.10.145</w:t>
+              <w:t xml:space="preserve">192.168.10.161</w:t>
             </w:r>
           </w:p>
         </w:tc>
@@ -8696,7 +8696,7 @@
                 <w:sz w:val="17"/>
                 <w:szCs w:val="17"/>
               </w:rPr>
-              <w:t xml:space="preserve">192.168.10.146 – 192.168.10.158</w:t>
+              <w:t xml:space="preserve">192.168.10.162 – 192.168.10.174</w:t>
             </w:r>
           </w:p>
         </w:tc>
@@ -8731,7 +8731,7 @@
                 <w:sz w:val="17"/>
                 <w:szCs w:val="17"/>
               </w:rPr>
-              <w:t xml:space="preserve">192.168.10.159</w:t>
+              <w:t xml:space="preserve">192.168.10.175</w:t>
             </w:r>
           </w:p>
         </w:tc>
@@ -9006,7 +9006,7 @@
                 <w:sz w:val="17"/>
                 <w:szCs w:val="17"/>
               </w:rPr>
-              <w:t xml:space="preserve">192.168.10.160</w:t>
+              <w:t xml:space="preserve">192.168.10.176</w:t>
             </w:r>
           </w:p>
         </w:tc>
@@ -9040,7 +9040,7 @@
                 <w:sz w:val="17"/>
                 <w:szCs w:val="17"/>
               </w:rPr>
-              <w:t xml:space="preserve">192.168.10.161</w:t>
+              <w:t xml:space="preserve">192.168.10.177</w:t>
             </w:r>
           </w:p>
         </w:tc>
@@ -9074,7 +9074,7 @@
                 <w:sz w:val="17"/>
                 <w:szCs w:val="17"/>
               </w:rPr>
-              <w:t xml:space="preserve">192.168.10.162 – 192.168.10.174</w:t>
+              <w:t xml:space="preserve">192.168.10.178 – 192.168.10.190</w:t>
             </w:r>
           </w:p>
         </w:tc>
@@ -9108,7 +9108,7 @@
                 <w:sz w:val="17"/>
                 <w:szCs w:val="17"/>
               </w:rPr>
-              <w:t xml:space="preserve">192.168.10.175</w:t>
+              <w:t xml:space="preserve">192.168.10.191</w:t>
             </w:r>
           </w:p>
         </w:tc>
@@ -9389,7 +9389,7 @@
                 <w:sz w:val="17"/>
                 <w:szCs w:val="17"/>
               </w:rPr>
-              <w:t xml:space="preserve">192.168.10.176</w:t>
+              <w:t xml:space="preserve">192.168.10.192</w:t>
             </w:r>
           </w:p>
         </w:tc>
@@ -9424,7 +9424,7 @@
                 <w:sz w:val="17"/>
                 <w:szCs w:val="17"/>
               </w:rPr>
-              <w:t xml:space="preserve">192.168.10.177</w:t>
+              <w:t xml:space="preserve">192.168.10.193</w:t>
             </w:r>
           </w:p>
         </w:tc>
@@ -9494,7 +9494,7 @@
                 <w:sz w:val="17"/>
                 <w:szCs w:val="17"/>
               </w:rPr>
-              <w:t xml:space="preserve">192.168.10.191</w:t>
+              <w:t xml:space="preserve">192.168.10.207</w:t>
             </w:r>
           </w:p>
         </w:tc>
@@ -9741,7 +9741,7 @@
                 <w:sz w:val="17"/>
                 <w:szCs w:val="17"/>
               </w:rPr>
-              <w:t xml:space="preserve">/26</w:t>
+              <w:t xml:space="preserve">/28</w:t>
             </w:r>
           </w:p>
         </w:tc>
@@ -9776,7 +9776,394 @@
                 <w:sz w:val="17"/>
                 <w:szCs w:val="17"/>
               </w:rPr>
-              <w:t xml:space="preserve">192.168.10.192</w:t>
+              <w:t xml:space="preserve">192.168.10.208</w:t>
+            </w:r>
+          </w:p>
+        </w:tc>
+        <w:tc>
+          <w:tcPr>
+            <w:tcW w:type="dxa" w:w="1400"/>
+            <w:tcBorders>
+              <w:top w:val="single" w:color="A6A6A6" w:sz="4"/>
+              <w:left w:val="single" w:color="A6A6A6" w:sz="4"/>
+              <w:bottom w:val="single" w:color="A6A6A6" w:sz="4"/>
+              <w:right w:val="single" w:color="A6A6A6" w:sz="4"/>
+            </w:tcBorders>
+            <w:shd w:fill="FFF2CC" w:color="auto" w:val="clear"/>
+            <w:tcMar>
+              <w:top w:type="dxa" w:w="50"/>
+              <w:left w:type="dxa" w:w="80"/>
+              <w:bottom w:type="dxa" w:w="50"/>
+              <w:right w:type="dxa" w:w="80"/>
+            </w:tcMar>
+            <w:vAlign w:val="center"/>
+          </w:tcPr>
+          <w:p>
+            <w:pPr>
+              <w:jc w:val="center"/>
+            </w:pPr>
+            <w:r>
+              <w:rPr>
+                <w:rFonts w:ascii="Calibri" w:cs="Calibri" w:eastAsia="Calibri" w:hAnsi="Calibri"/>
+                <w:b w:val="false"/>
+                <w:bCs w:val="false"/>
+                <w:color w:val="000000"/>
+                <w:sz w:val="17"/>
+                <w:szCs w:val="17"/>
+              </w:rPr>
+              <w:t xml:space="preserve">—</w:t>
+            </w:r>
+          </w:p>
+        </w:tc>
+        <w:tc>
+          <w:tcPr>
+            <w:tcW w:type="dxa" w:w="2800"/>
+            <w:tcBorders>
+              <w:top w:val="single" w:color="A6A6A6" w:sz="4"/>
+              <w:left w:val="single" w:color="A6A6A6" w:sz="4"/>
+              <w:bottom w:val="single" w:color="A6A6A6" w:sz="4"/>
+              <w:right w:val="single" w:color="A6A6A6" w:sz="4"/>
+            </w:tcBorders>
+            <w:shd w:fill="FFF2CC" w:color="auto" w:val="clear"/>
+            <w:tcMar>
+              <w:top w:type="dxa" w:w="50"/>
+              <w:left w:type="dxa" w:w="80"/>
+              <w:bottom w:type="dxa" w:w="50"/>
+              <w:right w:type="dxa" w:w="80"/>
+            </w:tcMar>
+            <w:vAlign w:val="center"/>
+          </w:tcPr>
+          <w:p>
+            <w:pPr>
+              <w:jc w:val="center"/>
+            </w:pPr>
+            <w:r>
+              <w:rPr>
+                <w:rFonts w:ascii="Calibri" w:cs="Calibri" w:eastAsia="Calibri" w:hAnsi="Calibri"/>
+                <w:b w:val="false"/>
+                <w:bCs w:val="false"/>
+                <w:color w:val="000000"/>
+                <w:sz w:val="17"/>
+                <w:szCs w:val="17"/>
+              </w:rPr>
+              <w:t xml:space="preserve">Crecimiento futuro</w:t>
+            </w:r>
+          </w:p>
+        </w:tc>
+        <w:tc>
+          <w:tcPr>
+            <w:tcW w:type="dxa" w:w="1400"/>
+            <w:tcBorders>
+              <w:top w:val="single" w:color="A6A6A6" w:sz="4"/>
+              <w:left w:val="single" w:color="A6A6A6" w:sz="4"/>
+              <w:bottom w:val="single" w:color="A6A6A6" w:sz="4"/>
+              <w:right w:val="single" w:color="A6A6A6" w:sz="4"/>
+            </w:tcBorders>
+            <w:shd w:fill="FFF2CC" w:color="auto" w:val="clear"/>
+            <w:tcMar>
+              <w:top w:type="dxa" w:w="50"/>
+              <w:left w:type="dxa" w:w="80"/>
+              <w:bottom w:type="dxa" w:w="50"/>
+              <w:right w:type="dxa" w:w="80"/>
+            </w:tcMar>
+            <w:vAlign w:val="center"/>
+          </w:tcPr>
+          <w:p>
+            <w:pPr>
+              <w:jc w:val="center"/>
+            </w:pPr>
+            <w:r>
+              <w:rPr>
+                <w:rFonts w:ascii="Calibri" w:cs="Calibri" w:eastAsia="Calibri" w:hAnsi="Calibri"/>
+                <w:b w:val="false"/>
+                <w:bCs w:val="false"/>
+                <w:color w:val="000000"/>
+                <w:sz w:val="17"/>
+                <w:szCs w:val="17"/>
+              </w:rPr>
+              <w:t xml:space="preserve">—</w:t>
+            </w:r>
+          </w:p>
+        </w:tc>
+        <w:tc>
+          <w:tcPr>
+            <w:tcW w:type="dxa" w:w="970"/>
+            <w:tcBorders>
+              <w:top w:val="single" w:color="A6A6A6" w:sz="4"/>
+              <w:left w:val="single" w:color="A6A6A6" w:sz="4"/>
+              <w:bottom w:val="single" w:color="A6A6A6" w:sz="4"/>
+              <w:right w:val="single" w:color="A6A6A6" w:sz="4"/>
+            </w:tcBorders>
+            <w:shd w:fill="FFF2CC" w:color="auto" w:val="clear"/>
+            <w:tcMar>
+              <w:top w:type="dxa" w:w="50"/>
+              <w:left w:type="dxa" w:w="80"/>
+              <w:bottom w:type="dxa" w:w="50"/>
+              <w:right w:type="dxa" w:w="80"/>
+            </w:tcMar>
+            <w:vAlign w:val="center"/>
+          </w:tcPr>
+          <w:p>
+            <w:pPr>
+              <w:jc w:val="center"/>
+            </w:pPr>
+            <w:r>
+              <w:rPr>
+                <w:rFonts w:ascii="Calibri" w:cs="Calibri" w:eastAsia="Calibri" w:hAnsi="Calibri"/>
+                <w:b w:val="false"/>
+                <w:bCs w:val="false"/>
+                <w:color w:val="000000"/>
+                <w:sz w:val="17"/>
+                <w:szCs w:val="17"/>
+              </w:rPr>
+              <w:t xml:space="preserve">—</w:t>
+            </w:r>
+          </w:p>
+        </w:tc>
+      </w:tr>
+      <w:tr>
+        <w:tc>
+          <w:tcPr>
+            <w:tcW w:type="dxa" w:w="600"/>
+            <w:tcBorders>
+              <w:top w:val="single" w:color="A6A6A6" w:sz="4"/>
+              <w:left w:val="single" w:color="A6A6A6" w:sz="4"/>
+              <w:bottom w:val="single" w:color="A6A6A6" w:sz="4"/>
+              <w:right w:val="single" w:color="A6A6A6" w:sz="4"/>
+            </w:tcBorders>
+            <w:shd w:fill="FFF2CC" w:color="auto" w:val="clear"/>
+            <w:tcMar>
+              <w:top w:type="dxa" w:w="50"/>
+              <w:left w:type="dxa" w:w="80"/>
+              <w:bottom w:type="dxa" w:w="50"/>
+              <w:right w:type="dxa" w:w="80"/>
+            </w:tcMar>
+            <w:vAlign w:val="center"/>
+          </w:tcPr>
+          <w:p>
+            <w:pPr>
+              <w:jc w:val="center"/>
+            </w:pPr>
+            <w:r>
+              <w:rPr>
+                <w:rFonts w:ascii="Calibri" w:cs="Calibri" w:eastAsia="Calibri" w:hAnsi="Calibri"/>
+                <w:b w:val="false"/>
+                <w:bCs w:val="false"/>
+                <w:color w:val="000000"/>
+                <w:sz w:val="17"/>
+                <w:szCs w:val="17"/>
+              </w:rPr>
+              <w:t xml:space="preserve">—</w:t>
+            </w:r>
+          </w:p>
+        </w:tc>
+        <w:tc>
+          <w:tcPr>
+            <w:tcW w:type="dxa" w:w="1750"/>
+            <w:tcBorders>
+              <w:top w:val="single" w:color="A6A6A6" w:sz="4"/>
+              <w:left w:val="single" w:color="A6A6A6" w:sz="4"/>
+              <w:bottom w:val="single" w:color="A6A6A6" w:sz="4"/>
+              <w:right w:val="single" w:color="A6A6A6" w:sz="4"/>
+            </w:tcBorders>
+            <w:shd w:fill="FFF2CC" w:color="auto" w:val="clear"/>
+            <w:tcMar>
+              <w:top w:type="dxa" w:w="50"/>
+              <w:left w:type="dxa" w:w="80"/>
+              <w:bottom w:type="dxa" w:w="50"/>
+              <w:right w:type="dxa" w:w="80"/>
+            </w:tcMar>
+            <w:vAlign w:val="center"/>
+          </w:tcPr>
+          <w:p>
+            <w:pPr>
+              <w:jc w:val="left"/>
+            </w:pPr>
+            <w:r>
+              <w:rPr>
+                <w:rFonts w:ascii="Calibri" w:cs="Calibri" w:eastAsia="Calibri" w:hAnsi="Calibri"/>
+                <w:b/>
+                <w:bCs/>
+                <w:color w:val="000000"/>
+                <w:sz w:val="17"/>
+                <w:szCs w:val="17"/>
+              </w:rPr>
+              <w:t xml:space="preserve">RESERVA</w:t>
+            </w:r>
+          </w:p>
+        </w:tc>
+        <w:tc>
+          <w:tcPr>
+            <w:tcW w:type="dxa" w:w="850"/>
+            <w:tcBorders>
+              <w:top w:val="single" w:color="A6A6A6" w:sz="4"/>
+              <w:left w:val="single" w:color="A6A6A6" w:sz="4"/>
+              <w:bottom w:val="single" w:color="A6A6A6" w:sz="4"/>
+              <w:right w:val="single" w:color="A6A6A6" w:sz="4"/>
+            </w:tcBorders>
+            <w:shd w:fill="FFF2CC" w:color="auto" w:val="clear"/>
+            <w:tcMar>
+              <w:top w:type="dxa" w:w="50"/>
+              <w:left w:type="dxa" w:w="80"/>
+              <w:bottom w:type="dxa" w:w="50"/>
+              <w:right w:type="dxa" w:w="80"/>
+            </w:tcMar>
+            <w:vAlign w:val="center"/>
+          </w:tcPr>
+          <w:p>
+            <w:pPr>
+              <w:jc w:val="center"/>
+            </w:pPr>
+            <w:r>
+              <w:rPr>
+                <w:rFonts w:ascii="Calibri" w:cs="Calibri" w:eastAsia="Calibri" w:hAnsi="Calibri"/>
+                <w:b w:val="false"/>
+                <w:bCs w:val="false"/>
+                <w:color w:val="000000"/>
+                <w:sz w:val="17"/>
+                <w:szCs w:val="17"/>
+              </w:rPr>
+              <w:t xml:space="preserve">—</w:t>
+            </w:r>
+          </w:p>
+        </w:tc>
+        <w:tc>
+          <w:tcPr>
+            <w:tcW w:type="dxa" w:w="800"/>
+            <w:tcBorders>
+              <w:top w:val="single" w:color="A6A6A6" w:sz="4"/>
+              <w:left w:val="single" w:color="A6A6A6" w:sz="4"/>
+              <w:bottom w:val="single" w:color="A6A6A6" w:sz="4"/>
+              <w:right w:val="single" w:color="A6A6A6" w:sz="4"/>
+            </w:tcBorders>
+            <w:shd w:fill="FFF2CC" w:color="auto" w:val="clear"/>
+            <w:tcMar>
+              <w:top w:type="dxa" w:w="50"/>
+              <w:left w:type="dxa" w:w="80"/>
+              <w:bottom w:type="dxa" w:w="50"/>
+              <w:right w:type="dxa" w:w="80"/>
+            </w:tcMar>
+            <w:vAlign w:val="center"/>
+          </w:tcPr>
+          <w:p>
+            <w:pPr>
+              <w:jc w:val="center"/>
+            </w:pPr>
+            <w:r>
+              <w:rPr>
+                <w:rFonts w:ascii="Calibri" w:cs="Calibri" w:eastAsia="Calibri" w:hAnsi="Calibri"/>
+                <w:b w:val="false"/>
+                <w:bCs w:val="false"/>
+                <w:color w:val="000000"/>
+                <w:sz w:val="17"/>
+                <w:szCs w:val="17"/>
+              </w:rPr>
+              <w:t xml:space="preserve">—</w:t>
+            </w:r>
+          </w:p>
+        </w:tc>
+        <w:tc>
+          <w:tcPr>
+            <w:tcW w:type="dxa" w:w="800"/>
+            <w:tcBorders>
+              <w:top w:val="single" w:color="A6A6A6" w:sz="4"/>
+              <w:left w:val="single" w:color="A6A6A6" w:sz="4"/>
+              <w:bottom w:val="single" w:color="A6A6A6" w:sz="4"/>
+              <w:right w:val="single" w:color="A6A6A6" w:sz="4"/>
+            </w:tcBorders>
+            <w:shd w:fill="FFF2CC" w:color="auto" w:val="clear"/>
+            <w:tcMar>
+              <w:top w:type="dxa" w:w="50"/>
+              <w:left w:type="dxa" w:w="80"/>
+              <w:bottom w:type="dxa" w:w="50"/>
+              <w:right w:type="dxa" w:w="80"/>
+            </w:tcMar>
+            <w:vAlign w:val="center"/>
+          </w:tcPr>
+          <w:p>
+            <w:pPr>
+              <w:jc w:val="center"/>
+            </w:pPr>
+            <w:r>
+              <w:rPr>
+                <w:rFonts w:ascii="Calibri" w:cs="Calibri" w:eastAsia="Calibri" w:hAnsi="Calibri"/>
+                <w:b w:val="false"/>
+                <w:bCs w:val="false"/>
+                <w:color w:val="000000"/>
+                <w:sz w:val="17"/>
+                <w:szCs w:val="17"/>
+              </w:rPr>
+              <w:t xml:space="preserve">—</w:t>
+            </w:r>
+          </w:p>
+        </w:tc>
+        <w:tc>
+          <w:tcPr>
+            <w:tcW w:type="dxa" w:w="1800"/>
+            <w:tcBorders>
+              <w:top w:val="single" w:color="A6A6A6" w:sz="4"/>
+              <w:left w:val="single" w:color="A6A6A6" w:sz="4"/>
+              <w:bottom w:val="single" w:color="A6A6A6" w:sz="4"/>
+              <w:right w:val="single" w:color="A6A6A6" w:sz="4"/>
+            </w:tcBorders>
+            <w:shd w:fill="FFF2CC" w:color="auto" w:val="clear"/>
+            <w:tcMar>
+              <w:top w:type="dxa" w:w="50"/>
+              <w:left w:type="dxa" w:w="80"/>
+              <w:bottom w:type="dxa" w:w="50"/>
+              <w:right w:type="dxa" w:w="80"/>
+            </w:tcMar>
+            <w:vAlign w:val="center"/>
+          </w:tcPr>
+          <w:p>
+            <w:pPr>
+              <w:jc w:val="center"/>
+            </w:pPr>
+            <w:r>
+              <w:rPr>
+                <w:rFonts w:ascii="Calibri" w:cs="Calibri" w:eastAsia="Calibri" w:hAnsi="Calibri"/>
+                <w:b w:val="false"/>
+                <w:bCs w:val="false"/>
+                <w:color w:val="000000"/>
+                <w:sz w:val="17"/>
+                <w:szCs w:val="17"/>
+              </w:rPr>
+              <w:t xml:space="preserve">/27</w:t>
+            </w:r>
+          </w:p>
+        </w:tc>
+        <w:tc>
+          <w:tcPr>
+            <w:tcW w:type="dxa" w:w="1400"/>
+            <w:tcBorders>
+              <w:top w:val="single" w:color="A6A6A6" w:sz="4"/>
+              <w:left w:val="single" w:color="A6A6A6" w:sz="4"/>
+              <w:bottom w:val="single" w:color="A6A6A6" w:sz="4"/>
+              <w:right w:val="single" w:color="A6A6A6" w:sz="4"/>
+            </w:tcBorders>
+            <w:shd w:fill="FFF2CC" w:color="auto" w:val="clear"/>
+            <w:tcMar>
+              <w:top w:type="dxa" w:w="50"/>
+              <w:left w:type="dxa" w:w="80"/>
+              <w:bottom w:type="dxa" w:w="50"/>
+              <w:right w:type="dxa" w:w="80"/>
+            </w:tcMar>
+            <w:vAlign w:val="center"/>
+          </w:tcPr>
+          <w:p>
+            <w:pPr>
+              <w:jc w:val="center"/>
+            </w:pPr>
+            <w:r>
+              <w:rPr>
+                <w:rFonts w:ascii="Calibri" w:cs="Calibri" w:eastAsia="Calibri" w:hAnsi="Calibri"/>
+                <w:b w:val="false"/>
+                <w:bCs w:val="false"/>
+                <w:color w:val="000000"/>
+                <w:sz w:val="17"/>
+                <w:szCs w:val="17"/>
+              </w:rPr>
+              <w:t xml:space="preserve">192.168.10.224</w:t>
             </w:r>
           </w:p>
         </w:tc>
@@ -9955,7 +10342,7 @@
           <w:sz w:val="21"/>
           <w:szCs w:val="21"/>
         </w:rPr>
-        <w:t xml:space="preserve">8 subredes, 112 hosts proyectados (usuarios y dispositivos), 192 de 256 direcciones asignadas. </w:t>
+        <w:t xml:space="preserve">8 subredes, 112 hosts proyectados (usuarios y dispositivos), 208 de 256 direcciones asignadas. </w:t>
       </w:r>
       <w:r>
         <w:rPr>
@@ -9963,7 +10350,7 @@
           <w:sz w:val="21"/>
           <w:szCs w:val="21"/>
         </w:rPr>
-        <w:t xml:space="preserve">Bloques libres para crecimiento: 192.168.10.192/26.</w:t>
+        <w:t xml:space="preserve">Bloques libres para crecimiento: 192.168.10.208/28, 192.168.10.224/27.</w:t>
       </w:r>
     </w:p>
     <w:p>

</xml_diff>